<commit_message>
Add bulk transcript ZIP export
</commit_message>
<xml_diff>
--- a/docs/GZWHISPER_PRODUCT_FUNCTIONALITY_RU.docx
+++ b/docs/GZWHISPER_PRODUCT_FUNCTIONALITY_RU.docx
@@ -88,7 +88,7 @@
           <w:color w:val="5D6875"/>
           <w:sz w:val="21"/>
         </w:rPr>
-        <w:t>Снимок продукта: 3 сентября 2026 года</w:t>
+        <w:t>Снимок продукта: 4 сентября 2026 года</w:t>
       </w:r>
     </w:p>
     <w:p>
@@ -116,7 +116,7 @@
           <w:color w:val="5D6875"/>
           <w:sz w:val="21"/>
         </w:rPr>
-        <w:t>Учтён HEAD: 05cdd4d — Name transcript exports after history items</w:t>
+        <w:t>Учтено актуальное состояние рабочего дерева, включая массовый экспорт в ZIP</w:t>
       </w:r>
     </w:p>
     <w:p>
@@ -3871,26 +3871,18 @@
       </w:r>
     </w:p>
     <w:p>
-      <w:r>
-        <w:rPr>
-          <w:rFonts w:ascii="Calibri" w:hAnsi="Calibri" w:eastAsia="Calibri"/>
-        </w:rPr>
-        <w:t xml:space="preserve">Последний пункт относится к актуальному HEAD после commit </w:t>
-      </w:r>
-      <w:r>
-        <w:rPr>
-          <w:rFonts w:ascii="Menlo" w:hAnsi="Menlo" w:eastAsia="Menlo"/>
-          <w:color w:val="1F4D78"/>
-          <w:sz w:val="21"/>
-          <w:shd w:fill="EDF1F5"/>
-        </w:rPr>
-        <w:t>05cdd4d</w:t>
-      </w:r>
-      <w:r>
-        <w:rPr>
-          <w:rFonts w:ascii="Calibri" w:hAnsi="Calibri" w:eastAsia="Calibri"/>
-        </w:rPr>
-        <w:t xml:space="preserve"> и пока отмечен в README как Unreleased поверх v1.5.2.</w:t>
+      <w:pPr>
+        <w:numPr>
+          <w:ilvl w:val="0"/>
+          <w:numId w:val="36"/>
+        </w:numPr>
+        <w:spacing w:before="0" w:after="80" w:line="300" w:lineRule="auto"/>
+      </w:pPr>
+      <w:r>
+        <w:rPr>
+          <w:rFonts w:ascii="Calibri" w:hAnsi="Calibri" w:eastAsia="Calibri"/>
+        </w:rPr>
+        <w:t>В отдельном режиме массового экспорта можно отметить несколько завершённых элементов, в том числе выбрать все видимые результаты поиска, и сохранить их одним ZIP-архивом с отдельным TXT- или JSON-файлом на каждый транскрипт. Совпадающие имена автоматически получают числовые суффиксы.</w:t>
       </w:r>
     </w:p>
     <w:p>
@@ -4075,6 +4067,7 @@
     <w:p>
       <w:pPr>
         <w:pStyle w:val="Heading2"/>
+        <w:pageBreakBefore/>
       </w:pPr>
       <w:r>
         <w:rPr>
@@ -4272,6 +4265,7 @@
     <w:p>
       <w:pPr>
         <w:pStyle w:val="Heading2"/>
+        <w:pageBreakBefore/>
       </w:pPr>
       <w:r>
         <w:rPr>
@@ -4639,19 +4633,6 @@
     </w:p>
     <w:p>
       <w:pPr>
-        <w:pStyle w:val="Heading1"/>
-      </w:pPr>
-      <w:r>
-        <w:rPr>
-          <w:rFonts w:ascii="Calibri" w:hAnsi="Calibri" w:eastAsia="Calibri"/>
-          <w:color w:val="2E74B5"/>
-          <w:sz w:val="32"/>
-        </w:rPr>
-        <w:t>11. Интерфейс и UX macOS</w:t>
-      </w:r>
-    </w:p>
-    <w:p>
-      <w:pPr>
         <w:pStyle w:val="Heading2"/>
       </w:pPr>
       <w:r>
@@ -4660,15 +4641,7 @@
           <w:color w:val="2E74B5"/>
           <w:sz w:val="26"/>
         </w:rPr>
-        <w:t>11.1. Основная компоновка</w:t>
-      </w:r>
-    </w:p>
-    <w:p>
-      <w:r>
-        <w:rPr>
-          <w:rFonts w:ascii="Calibri" w:hAnsi="Calibri" w:eastAsia="Calibri"/>
-        </w:rPr>
-        <w:t>Окно состоит из:</w:t>
+        <w:t>10.5. Массовый экспорт на macOS</w:t>
       </w:r>
     </w:p>
     <w:p>
@@ -4683,7 +4656,7 @@
         <w:rPr>
           <w:rFonts w:ascii="Calibri" w:hAnsi="Calibri" w:eastAsia="Calibri"/>
         </w:rPr>
-        <w:t>компактной верхней карточки со словом GZWhisper, версией, статусом модели и прогрессом загрузки;</w:t>
+        <w:t>Запускается кнопкой архива в заголовке истории и использует отдельный от очереди режим выбора.</w:t>
       </w:r>
     </w:p>
     <w:p>
@@ -4698,7 +4671,7 @@
         <w:rPr>
           <w:rFonts w:ascii="Calibri" w:hAnsi="Calibri" w:eastAsia="Calibri"/>
         </w:rPr>
-        <w:t>скрываемой левой панели истории;</w:t>
+        <w:t>Экспортирует только завершённые элементы, у которых сохранён transcript-файл.</w:t>
       </w:r>
     </w:p>
     <w:p>
@@ -4713,7 +4686,7 @@
         <w:rPr>
           <w:rFonts w:ascii="Calibri" w:hAnsi="Calibri" w:eastAsia="Calibri"/>
         </w:rPr>
-        <w:t>карточки входа с очередью, языком и записью;</w:t>
+        <w:t>Пользователь выбирает единый формат для всей выборки: TXT или JSON.</w:t>
       </w:r>
     </w:p>
     <w:p>
@@ -4728,7 +4701,7 @@
         <w:rPr>
           <w:rFonts w:ascii="Calibri" w:hAnsi="Calibri" w:eastAsia="Calibri"/>
         </w:rPr>
-        <w:t>большой карточки редактора результата;</w:t>
+        <w:t>Результат — один ZIP без дополнительной корневой папки, с отдельным файлом на каждый выбранный транскрипт.</w:t>
       </w:r>
     </w:p>
     <w:p>
@@ -4743,15 +4716,50 @@
         <w:rPr>
           <w:rFonts w:ascii="Calibri" w:hAnsi="Calibri" w:eastAsia="Calibri"/>
         </w:rPr>
-        <w:t>нижней строки состояния и debug-меню.</w:t>
-      </w:r>
-    </w:p>
-    <w:p>
-      <w:r>
-        <w:rPr>
-          <w:rFonts w:ascii="Calibri" w:hAnsi="Calibri" w:eastAsia="Calibri"/>
-        </w:rPr>
-        <w:t>Минимальный размер окна: 640×500; идеальный — около 1100×760. Для узких окон используются альтернативные компактные варианты контролов: текстовые кнопки заменяются иконками, а блок записи перестраивается на две строки. Это позволяет избежать вертикального текста и обрезанных кнопок.</w:t>
+        <w:t>Имена строятся из текущих отображаемых имён, очищаются от недопустимых символов и делаются уникальными числовыми суффиксами.</w:t>
+      </w:r>
+    </w:p>
+    <w:p>
+      <w:pPr>
+        <w:numPr>
+          <w:ilvl w:val="0"/>
+          <w:numId w:val="41"/>
+        </w:numPr>
+        <w:spacing w:before="0" w:after="80" w:line="300" w:lineRule="auto"/>
+      </w:pPr>
+      <w:r>
+        <w:rPr>
+          <w:rFonts w:ascii="Calibri" w:hAnsi="Calibri" w:eastAsia="Calibri"/>
+        </w:rPr>
+        <w:t xml:space="preserve">Исторические JSON содержат текст, дату экспорта, исходный путь, язык и модель при наличии; </w:t>
+      </w:r>
+      <w:r>
+        <w:rPr>
+          <w:rFonts w:ascii="Menlo" w:hAnsi="Menlo" w:eastAsia="Menlo"/>
+          <w:color w:val="1F4D78"/>
+          <w:sz w:val="21"/>
+          <w:shd w:fill="EDF1F5"/>
+        </w:rPr>
+        <w:t>segments</w:t>
+      </w:r>
+      <w:r>
+        <w:rPr>
+          <w:rFonts w:ascii="Calibri" w:hAnsi="Calibri" w:eastAsia="Calibri"/>
+        </w:rPr>
+        <w:t xml:space="preserve"> остаётся пустым, поскольку сегменты не сохраняются в истории.</w:t>
+      </w:r>
+    </w:p>
+    <w:p>
+      <w:pPr>
+        <w:pStyle w:val="Heading1"/>
+      </w:pPr>
+      <w:r>
+        <w:rPr>
+          <w:rFonts w:ascii="Calibri" w:hAnsi="Calibri" w:eastAsia="Calibri"/>
+          <w:color w:val="2E74B5"/>
+          <w:sz w:val="32"/>
+        </w:rPr>
+        <w:t>11. Интерфейс и UX macOS</w:t>
       </w:r>
     </w:p>
     <w:p>
@@ -4764,7 +4772,15 @@
           <w:color w:val="2E74B5"/>
           <w:sz w:val="26"/>
         </w:rPr>
-        <w:t>11.2. Визуальный стиль</w:t>
+        <w:t>11.1. Основная компоновка</w:t>
+      </w:r>
+    </w:p>
+    <w:p>
+      <w:r>
+        <w:rPr>
+          <w:rFonts w:ascii="Calibri" w:hAnsi="Calibri" w:eastAsia="Calibri"/>
+        </w:rPr>
+        <w:t>Окно состоит из:</w:t>
       </w:r>
     </w:p>
     <w:p>
@@ -4779,7 +4795,7 @@
         <w:rPr>
           <w:rFonts w:ascii="Calibri" w:hAnsi="Calibri" w:eastAsia="Calibri"/>
         </w:rPr>
-        <w:t>Поддерживаются светлая и тёмная системные темы.</w:t>
+        <w:t>компактной верхней карточки со словом GZWhisper, версией, статусом модели и прогрессом загрузки;</w:t>
       </w:r>
     </w:p>
     <w:p>
@@ -4794,7 +4810,7 @@
         <w:rPr>
           <w:rFonts w:ascii="Calibri" w:hAnsi="Calibri" w:eastAsia="Calibri"/>
         </w:rPr>
-        <w:t>Используются полупрозрачные карточки, мягкий градиент фона, rounded controls и системные SF Symbols.</w:t>
+        <w:t>скрываемой левой панели истории;</w:t>
       </w:r>
     </w:p>
     <w:p>
@@ -4809,7 +4825,7 @@
         <w:rPr>
           <w:rFonts w:ascii="Calibri" w:hAnsi="Calibri" w:eastAsia="Calibri"/>
         </w:rPr>
-        <w:t>Текущий выбранный элемент истории визуально выделяется.</w:t>
+        <w:t>карточки входа с очередью, языком и записью;</w:t>
       </w:r>
     </w:p>
     <w:p>
@@ -4824,7 +4840,7 @@
         <w:rPr>
           <w:rFonts w:ascii="Calibri" w:hAnsi="Calibri" w:eastAsia="Calibri"/>
         </w:rPr>
-        <w:t>Состояния имеют цветовые индикаторы: completed — зелёный, processing — оранжевый, failed — красный.</w:t>
+        <w:t>большой карточки редактора результата;</w:t>
       </w:r>
     </w:p>
     <w:p>
@@ -4839,7 +4855,15 @@
         <w:rPr>
           <w:rFonts w:ascii="Calibri" w:hAnsi="Calibri" w:eastAsia="Calibri"/>
         </w:rPr>
-        <w:t>Hover-состояние локализовано внутри отдельной строки, чтобы движение указателя не вызывало перерисовку всей истории.</w:t>
+        <w:t>нижней строки состояния и debug-меню.</w:t>
+      </w:r>
+    </w:p>
+    <w:p>
+      <w:r>
+        <w:rPr>
+          <w:rFonts w:ascii="Calibri" w:hAnsi="Calibri" w:eastAsia="Calibri"/>
+        </w:rPr>
+        <w:t>Минимальный размер окна: 640×500; идеальный — около 1100×760. Для узких окон используются альтернативные компактные варианты контролов: текстовые кнопки заменяются иконками, а блок записи перестраивается на две строки. Это позволяет избежать вертикального текста и обрезанных кнопок.</w:t>
       </w:r>
     </w:p>
     <w:p>
@@ -4852,15 +4876,7 @@
           <w:color w:val="2E74B5"/>
           <w:sz w:val="26"/>
         </w:rPr>
-        <w:t>11.3. Строка состояния</w:t>
-      </w:r>
-    </w:p>
-    <w:p>
-      <w:r>
-        <w:rPr>
-          <w:rFonts w:ascii="Calibri" w:hAnsi="Calibri" w:eastAsia="Calibri"/>
-        </w:rPr>
-        <w:t>В обычном состоянии footer показывает последнее сообщение. Во время работы:</w:t>
+        <w:t>11.2. Визуальный стиль</w:t>
       </w:r>
     </w:p>
     <w:p>
@@ -4875,7 +4891,7 @@
         <w:rPr>
           <w:rFonts w:ascii="Calibri" w:hAnsi="Calibri" w:eastAsia="Calibri"/>
         </w:rPr>
-        <w:t>транскрибация показывает имя и процент;</w:t>
+        <w:t>Поддерживаются светлая и тёмная системные темы.</w:t>
       </w:r>
     </w:p>
     <w:p>
@@ -4890,7 +4906,7 @@
         <w:rPr>
           <w:rFonts w:ascii="Calibri" w:hAnsi="Calibri" w:eastAsia="Calibri"/>
         </w:rPr>
-        <w:t>запись показывает таймер и состояние паузы;</w:t>
+        <w:t>Используются полупрозрачные карточки, мягкий градиент фона, rounded controls и системные SF Symbols.</w:t>
       </w:r>
     </w:p>
     <w:p>
@@ -4905,7 +4921,7 @@
         <w:rPr>
           <w:rFonts w:ascii="Calibri" w:hAnsi="Calibri" w:eastAsia="Calibri"/>
         </w:rPr>
-        <w:t>при одновременной работе обе сводки разделены divider;</w:t>
+        <w:t>Текущий выбранный элемент истории визуально выделяется.</w:t>
       </w:r>
     </w:p>
     <w:p>
@@ -4920,7 +4936,22 @@
         <w:rPr>
           <w:rFonts w:ascii="Calibri" w:hAnsi="Calibri" w:eastAsia="Calibri"/>
         </w:rPr>
-        <w:t>уведомление об удалении и Undo показывается отдельно, без дублирования текста статуса.</w:t>
+        <w:t>Состояния имеют цветовые индикаторы: completed — зелёный, processing — оранжевый, failed — красный.</w:t>
+      </w:r>
+    </w:p>
+    <w:p>
+      <w:pPr>
+        <w:numPr>
+          <w:ilvl w:val="0"/>
+          <w:numId w:val="43"/>
+        </w:numPr>
+        <w:spacing w:before="0" w:after="80" w:line="300" w:lineRule="auto"/>
+      </w:pPr>
+      <w:r>
+        <w:rPr>
+          <w:rFonts w:ascii="Calibri" w:hAnsi="Calibri" w:eastAsia="Calibri"/>
+        </w:rPr>
+        <w:t>Hover-состояние локализовано внутри отдельной строки, чтобы движение указателя не вызывало перерисовку всей истории.</w:t>
       </w:r>
     </w:p>
     <w:p>
@@ -4933,15 +4964,15 @@
           <w:color w:val="2E74B5"/>
           <w:sz w:val="26"/>
         </w:rPr>
-        <w:t>11.4. Диагностика</w:t>
-      </w:r>
-    </w:p>
-    <w:p>
-      <w:r>
-        <w:rPr>
-          <w:rFonts w:ascii="Calibri" w:hAnsi="Calibri" w:eastAsia="Calibri"/>
-        </w:rPr>
-        <w:t>Debug-меню позволяет:</w:t>
+        <w:t>11.3. Строка состояния</w:t>
+      </w:r>
+    </w:p>
+    <w:p>
+      <w:r>
+        <w:rPr>
+          <w:rFonts w:ascii="Calibri" w:hAnsi="Calibri" w:eastAsia="Calibri"/>
+        </w:rPr>
+        <w:t>В обычном состоянии footer показывает последнее сообщение. Во время работы:</w:t>
       </w:r>
     </w:p>
     <w:p>
@@ -4956,7 +4987,7 @@
         <w:rPr>
           <w:rFonts w:ascii="Calibri" w:hAnsi="Calibri" w:eastAsia="Calibri"/>
         </w:rPr>
-        <w:t>скопировать диагностический отчёт в буфер обмена;</w:t>
+        <w:t>транскрибация показывает имя и процент;</w:t>
       </w:r>
     </w:p>
     <w:p>
@@ -4971,7 +5002,7 @@
         <w:rPr>
           <w:rFonts w:ascii="Calibri" w:hAnsi="Calibri" w:eastAsia="Calibri"/>
         </w:rPr>
-        <w:t>открыть runtime-папку в Finder;</w:t>
+        <w:t>запись показывает таймер и состояние паузы;</w:t>
       </w:r>
     </w:p>
     <w:p>
@@ -4986,7 +5017,7 @@
         <w:rPr>
           <w:rFonts w:ascii="Calibri" w:hAnsi="Calibri" w:eastAsia="Calibri"/>
         </w:rPr>
-        <w:t>перейти на GitHub проекта;</w:t>
+        <w:t>при одновременной работе обе сводки разделены divider;</w:t>
       </w:r>
     </w:p>
     <w:p>
@@ -5001,28 +5032,7 @@
         <w:rPr>
           <w:rFonts w:ascii="Calibri" w:hAnsi="Calibri" w:eastAsia="Calibri"/>
         </w:rPr>
-        <w:t>открыть сайт автора.</w:t>
-      </w:r>
-    </w:p>
-    <w:p>
-      <w:r>
-        <w:rPr>
-          <w:rFonts w:ascii="Calibri" w:hAnsi="Calibri" w:eastAsia="Calibri"/>
-        </w:rPr>
-        <w:t>Отчёт включает версию и build, язык UI, текущий статус, runtime issue, выбранный и определённый язык, размеры истории и очереди, состояния записи/транскрибации, выбранный history item, первую найденную ошибку и пути/состояние Python runtime и venv.</w:t>
-      </w:r>
-    </w:p>
-    <w:p>
-      <w:pPr>
-        <w:pStyle w:val="Heading1"/>
-      </w:pPr>
-      <w:r>
-        <w:rPr>
-          <w:rFonts w:ascii="Calibri" w:hAnsi="Calibri" w:eastAsia="Calibri"/>
-          <w:color w:val="2E74B5"/>
-          <w:sz w:val="32"/>
-        </w:rPr>
-        <w:t>12. Локальное хранение, приватность и жизненный цикл данных</w:t>
+        <w:t>уведомление об удалении и Undo показывается отдельно, без дублирования текста статуса.</w:t>
       </w:r>
     </w:p>
     <w:p>
@@ -5035,7 +5045,15 @@
           <w:color w:val="2E74B5"/>
           <w:sz w:val="26"/>
         </w:rPr>
-        <w:t>12.1. Что остаётся локальным</w:t>
+        <w:t>11.4. Диагностика</w:t>
+      </w:r>
+    </w:p>
+    <w:p>
+      <w:r>
+        <w:rPr>
+          <w:rFonts w:ascii="Calibri" w:hAnsi="Calibri" w:eastAsia="Calibri"/>
+        </w:rPr>
+        <w:t>Debug-меню позволяет:</w:t>
       </w:r>
     </w:p>
     <w:p>
@@ -5050,7 +5068,7 @@
         <w:rPr>
           <w:rFonts w:ascii="Calibri" w:hAnsi="Calibri" w:eastAsia="Calibri"/>
         </w:rPr>
-        <w:t>Распознавание выполняется локально.</w:t>
+        <w:t>скопировать диагностический отчёт в буфер обмена;</w:t>
       </w:r>
     </w:p>
     <w:p>
@@ -5065,7 +5083,7 @@
         <w:rPr>
           <w:rFonts w:ascii="Calibri" w:hAnsi="Calibri" w:eastAsia="Calibri"/>
         </w:rPr>
-        <w:t>Медиа для транскрибации не отправляется в облачный сервис GZWhisper.</w:t>
+        <w:t>открыть runtime-папку в Finder;</w:t>
       </w:r>
     </w:p>
     <w:p>
@@ -5080,7 +5098,7 @@
         <w:rPr>
           <w:rFonts w:ascii="Calibri" w:hAnsi="Calibri" w:eastAsia="Calibri"/>
         </w:rPr>
-        <w:t>Аккаунт и авторизация не требуются.</w:t>
+        <w:t>перейти на GitHub проекта;</w:t>
       </w:r>
     </w:p>
     <w:p>
@@ -5095,30 +5113,28 @@
         <w:rPr>
           <w:rFonts w:ascii="Calibri" w:hAnsi="Calibri" w:eastAsia="Calibri"/>
         </w:rPr>
-        <w:t>В проекте нет встроенной телеметрии, аналитики использования, рекламного SDK или синхронизации истории.</w:t>
-      </w:r>
-    </w:p>
-    <w:p>
-      <w:pPr>
-        <w:numPr>
-          <w:ilvl w:val="0"/>
-          <w:numId w:val="45"/>
-        </w:numPr>
-        <w:spacing w:before="0" w:after="80" w:line="300" w:lineRule="auto"/>
-      </w:pPr>
-      <w:r>
-        <w:rPr>
-          <w:rFonts w:ascii="Calibri" w:hAnsi="Calibri" w:eastAsia="Calibri"/>
-        </w:rPr>
-        <w:t>После загрузки модели транскрибация может работать без сети, если runtime и зависимости уже подготовлены.</w:t>
-      </w:r>
-    </w:p>
-    <w:p>
-      <w:r>
-        <w:rPr>
-          <w:rFonts w:ascii="Calibri" w:hAnsi="Calibri" w:eastAsia="Calibri"/>
-        </w:rPr>
-        <w:t>Сеть требуется для первичного скачивания модели и, при отсутствии/ошибке встроенного набора зависимостей, может понадобиться для установки Python-пакетов через PyPI.</w:t>
+        <w:t>открыть сайт автора.</w:t>
+      </w:r>
+    </w:p>
+    <w:p>
+      <w:r>
+        <w:rPr>
+          <w:rFonts w:ascii="Calibri" w:hAnsi="Calibri" w:eastAsia="Calibri"/>
+        </w:rPr>
+        <w:t>Отчёт включает версию и build, язык UI, текущий статус, runtime issue, выбранный и определённый язык, размеры истории и очереди, состояния записи/транскрибации, выбранный history item, первую найденную ошибку и пути/состояние Python runtime и venv.</w:t>
+      </w:r>
+    </w:p>
+    <w:p>
+      <w:pPr>
+        <w:pStyle w:val="Heading1"/>
+      </w:pPr>
+      <w:r>
+        <w:rPr>
+          <w:rFonts w:ascii="Calibri" w:hAnsi="Calibri" w:eastAsia="Calibri"/>
+          <w:color w:val="2E74B5"/>
+          <w:sz w:val="32"/>
+        </w:rPr>
+        <w:t>12. Локальное хранение, приватность и жизненный цикл данных</w:t>
       </w:r>
     </w:p>
     <w:p>
@@ -5131,7 +5147,7 @@
           <w:color w:val="2E74B5"/>
           <w:sz w:val="26"/>
         </w:rPr>
-        <w:t>12.2. Где хранятся данные на macOS</w:t>
+        <w:t>12.1. Что остаётся локальным</w:t>
       </w:r>
     </w:p>
     <w:p>
@@ -5146,22 +5162,7 @@
         <w:rPr>
           <w:rFonts w:ascii="Calibri" w:hAnsi="Calibri" w:eastAsia="Calibri"/>
         </w:rPr>
-        <w:t xml:space="preserve">Модель и транскрипты по умолчанию: </w:t>
-      </w:r>
-      <w:r>
-        <w:rPr>
-          <w:rFonts w:ascii="Menlo" w:hAnsi="Menlo" w:eastAsia="Menlo"/>
-          <w:color w:val="1F4D78"/>
-          <w:sz w:val="21"/>
-          <w:shd w:fill="EDF1F5"/>
-        </w:rPr>
-        <w:t>~/Documents/GZWhisper/</w:t>
-      </w:r>
-      <w:r>
-        <w:rPr>
-          <w:rFonts w:ascii="Calibri" w:hAnsi="Calibri" w:eastAsia="Calibri"/>
-        </w:rPr>
-        <w:t>.</w:t>
+        <w:t>Распознавание выполняется локально.</w:t>
       </w:r>
     </w:p>
     <w:p>
@@ -5176,22 +5177,7 @@
         <w:rPr>
           <w:rFonts w:ascii="Calibri" w:hAnsi="Calibri" w:eastAsia="Calibri"/>
         </w:rPr>
-        <w:t xml:space="preserve">Транскрипты, записи и history JSON: </w:t>
-      </w:r>
-      <w:r>
-        <w:rPr>
-          <w:rFonts w:ascii="Menlo" w:hAnsi="Menlo" w:eastAsia="Menlo"/>
-          <w:color w:val="1F4D78"/>
-          <w:sz w:val="21"/>
-          <w:shd w:fill="EDF1F5"/>
-        </w:rPr>
-        <w:t>~/Documents/GZWhisper/transcripts/</w:t>
-      </w:r>
-      <w:r>
-        <w:rPr>
-          <w:rFonts w:ascii="Calibri" w:hAnsi="Calibri" w:eastAsia="Calibri"/>
-        </w:rPr>
-        <w:t>.</w:t>
+        <w:t>Медиа для транскрибации не отправляется в облачный сервис GZWhisper.</w:t>
       </w:r>
     </w:p>
     <w:p>
@@ -5206,22 +5192,7 @@
         <w:rPr>
           <w:rFonts w:ascii="Calibri" w:hAnsi="Calibri" w:eastAsia="Calibri"/>
         </w:rPr>
-        <w:t xml:space="preserve">Runtime, venv, worker и ссылка на выбранную модель: </w:t>
-      </w:r>
-      <w:r>
-        <w:rPr>
-          <w:rFonts w:ascii="Menlo" w:hAnsi="Menlo" w:eastAsia="Menlo"/>
-          <w:color w:val="1F4D78"/>
-          <w:sz w:val="21"/>
-          <w:shd w:fill="EDF1F5"/>
-        </w:rPr>
-        <w:t>~/Library/Application Support/GZWhisper/</w:t>
-      </w:r>
-      <w:r>
-        <w:rPr>
-          <w:rFonts w:ascii="Calibri" w:hAnsi="Calibri" w:eastAsia="Calibri"/>
-        </w:rPr>
-        <w:t>.</w:t>
+        <w:t>Аккаунт и авторизация не требуются.</w:t>
       </w:r>
     </w:p>
     <w:p>
@@ -5236,45 +5207,30 @@
         <w:rPr>
           <w:rFonts w:ascii="Calibri" w:hAnsi="Calibri" w:eastAsia="Calibri"/>
         </w:rPr>
-        <w:t xml:space="preserve">Staging незавершённых записей: </w:t>
-      </w:r>
-      <w:r>
-        <w:rPr>
-          <w:rFonts w:ascii="Menlo" w:hAnsi="Menlo" w:eastAsia="Menlo"/>
-          <w:color w:val="1F4D78"/>
-          <w:sz w:val="21"/>
-          <w:shd w:fill="EDF1F5"/>
-        </w:rPr>
-        <w:t>~/Library/Application Support/GZWhisper/recording-sessions/in-progress/</w:t>
-      </w:r>
-      <w:r>
-        <w:rPr>
-          <w:rFonts w:ascii="Calibri" w:hAnsi="Calibri" w:eastAsia="Calibri"/>
-        </w:rPr>
-        <w:t>.</w:t>
-      </w:r>
-    </w:p>
-    <w:p>
-      <w:r>
-        <w:rPr>
-          <w:rFonts w:ascii="Calibri" w:hAnsi="Calibri" w:eastAsia="Calibri"/>
-        </w:rPr>
-        <w:t xml:space="preserve">Пользователь может выбрать другую папку при скачивании модели, но папка транскриптов по текущей реализации остаётся внутри стандартного </w:t>
-      </w:r>
-      <w:r>
-        <w:rPr>
-          <w:rFonts w:ascii="Menlo" w:hAnsi="Menlo" w:eastAsia="Menlo"/>
-          <w:color w:val="1F4D78"/>
-          <w:sz w:val="21"/>
-          <w:shd w:fill="EDF1F5"/>
-        </w:rPr>
-        <w:t>~/Documents/GZWhisper</w:t>
-      </w:r>
-      <w:r>
-        <w:rPr>
-          <w:rFonts w:ascii="Calibri" w:hAnsi="Calibri" w:eastAsia="Calibri"/>
-        </w:rPr>
-        <w:t>.</w:t>
+        <w:t>В проекте нет встроенной телеметрии, аналитики использования, рекламного SDK или синхронизации истории.</w:t>
+      </w:r>
+    </w:p>
+    <w:p>
+      <w:pPr>
+        <w:numPr>
+          <w:ilvl w:val="0"/>
+          <w:numId w:val="46"/>
+        </w:numPr>
+        <w:spacing w:before="0" w:after="80" w:line="300" w:lineRule="auto"/>
+      </w:pPr>
+      <w:r>
+        <w:rPr>
+          <w:rFonts w:ascii="Calibri" w:hAnsi="Calibri" w:eastAsia="Calibri"/>
+        </w:rPr>
+        <w:t>После загрузки модели транскрибация может работать без сети, если runtime и зависимости уже подготовлены.</w:t>
+      </w:r>
+    </w:p>
+    <w:p>
+      <w:r>
+        <w:rPr>
+          <w:rFonts w:ascii="Calibri" w:hAnsi="Calibri" w:eastAsia="Calibri"/>
+        </w:rPr>
+        <w:t>Сеть требуется для первичного скачивания модели и, при отсутствии/ошибке встроенного набора зависимостей, может понадобиться для установки Python-пакетов через PyPI.</w:t>
       </w:r>
     </w:p>
     <w:p>
@@ -5287,36 +5243,7 @@
           <w:color w:val="2E74B5"/>
           <w:sz w:val="26"/>
         </w:rPr>
-        <w:t>12.3. Сохранение истории</w:t>
-      </w:r>
-    </w:p>
-    <w:p>
-      <w:r>
-        <w:rPr>
-          <w:rFonts w:ascii="Calibri" w:hAnsi="Calibri" w:eastAsia="Calibri"/>
-        </w:rPr>
-        <w:t>История хранится как локальный JSON. Между запусками сохраняются завершённые, failed и имеющие артефакты элементы, а также queued-записи. Чисто временные импортированные элементы без результата не обязаны сохраняться. Если приложение завершилось во время обработки сохранённой аудиозаписи, при следующем запуске такой элемент возвращается в очередь; неподкреплённый аудиоартефактом processing-элемент помечается failed.</w:t>
-      </w:r>
-    </w:p>
-    <w:p>
-      <w:pPr>
-        <w:pStyle w:val="Heading1"/>
-      </w:pPr>
-      <w:r>
-        <w:rPr>
-          <w:rFonts w:ascii="Calibri" w:hAnsi="Calibri" w:eastAsia="Calibri"/>
-          <w:color w:val="2E74B5"/>
-          <w:sz w:val="32"/>
-        </w:rPr>
-        <w:t>13. Функциональность Linux/Windows относительно macOS</w:t>
-      </w:r>
-    </w:p>
-    <w:p>
-      <w:r>
-        <w:rPr>
-          <w:rFonts w:ascii="Calibri" w:hAnsi="Calibri" w:eastAsia="Calibri"/>
-        </w:rPr>
-        <w:t>В Linux/Windows уже есть:</w:t>
+        <w:t>12.2. Где хранятся данные на macOS</w:t>
       </w:r>
     </w:p>
     <w:p>
@@ -5331,7 +5258,22 @@
         <w:rPr>
           <w:rFonts w:ascii="Calibri" w:hAnsi="Calibri" w:eastAsia="Calibri"/>
         </w:rPr>
-        <w:t>автоматическая локализация RU/EN/ZH;</w:t>
+        <w:t xml:space="preserve">Модель и транскрипты по умолчанию: </w:t>
+      </w:r>
+      <w:r>
+        <w:rPr>
+          <w:rFonts w:ascii="Menlo" w:hAnsi="Menlo" w:eastAsia="Menlo"/>
+          <w:color w:val="1F4D78"/>
+          <w:sz w:val="21"/>
+          <w:shd w:fill="EDF1F5"/>
+        </w:rPr>
+        <w:t>~/Documents/GZWhisper/</w:t>
+      </w:r>
+      <w:r>
+        <w:rPr>
+          <w:rFonts w:ascii="Calibri" w:hAnsi="Calibri" w:eastAsia="Calibri"/>
+        </w:rPr>
+        <w:t>.</w:t>
       </w:r>
     </w:p>
     <w:p>
@@ -5346,7 +5288,22 @@
         <w:rPr>
           <w:rFonts w:ascii="Calibri" w:hAnsi="Calibri" w:eastAsia="Calibri"/>
         </w:rPr>
-        <w:t>скачивание одной из двух моделей-кандидатов и отображение прогресса;</w:t>
+        <w:t xml:space="preserve">Транскрипты, записи и history JSON: </w:t>
+      </w:r>
+      <w:r>
+        <w:rPr>
+          <w:rFonts w:ascii="Menlo" w:hAnsi="Menlo" w:eastAsia="Menlo"/>
+          <w:color w:val="1F4D78"/>
+          <w:sz w:val="21"/>
+          <w:shd w:fill="EDF1F5"/>
+        </w:rPr>
+        <w:t>~/Documents/GZWhisper/transcripts/</w:t>
+      </w:r>
+      <w:r>
+        <w:rPr>
+          <w:rFonts w:ascii="Calibri" w:hAnsi="Calibri" w:eastAsia="Calibri"/>
+        </w:rPr>
+        <w:t>.</w:t>
       </w:r>
     </w:p>
     <w:p>
@@ -5361,7 +5318,22 @@
         <w:rPr>
           <w:rFonts w:ascii="Calibri" w:hAnsi="Calibri" w:eastAsia="Calibri"/>
         </w:rPr>
-        <w:t>подключение и валидация локальной faster-whisper-модели;</w:t>
+        <w:t xml:space="preserve">Runtime, venv, worker и ссылка на выбранную модель: </w:t>
+      </w:r>
+      <w:r>
+        <w:rPr>
+          <w:rFonts w:ascii="Menlo" w:hAnsi="Menlo" w:eastAsia="Menlo"/>
+          <w:color w:val="1F4D78"/>
+          <w:sz w:val="21"/>
+          <w:shd w:fill="EDF1F5"/>
+        </w:rPr>
+        <w:t>~/Library/Application Support/GZWhisper/</w:t>
+      </w:r>
+      <w:r>
+        <w:rPr>
+          <w:rFonts w:ascii="Calibri" w:hAnsi="Calibri" w:eastAsia="Calibri"/>
+        </w:rPr>
+        <w:t>.</w:t>
       </w:r>
     </w:p>
     <w:p>
@@ -5376,165 +5348,87 @@
         <w:rPr>
           <w:rFonts w:ascii="Calibri" w:hAnsi="Calibri" w:eastAsia="Calibri"/>
         </w:rPr>
-        <w:t>открытие папки модели;</w:t>
-      </w:r>
-    </w:p>
-    <w:p>
-      <w:pPr>
-        <w:numPr>
-          <w:ilvl w:val="0"/>
-          <w:numId w:val="47"/>
-        </w:numPr>
-        <w:spacing w:before="0" w:after="80" w:line="300" w:lineRule="auto"/>
-      </w:pPr>
-      <w:r>
-        <w:rPr>
-          <w:rFonts w:ascii="Calibri" w:hAnsi="Calibri" w:eastAsia="Calibri"/>
-        </w:rPr>
-        <w:t>удаление скачанной модели или отвязка внешней;</w:t>
-      </w:r>
-    </w:p>
-    <w:p>
-      <w:pPr>
-        <w:numPr>
-          <w:ilvl w:val="0"/>
-          <w:numId w:val="47"/>
-        </w:numPr>
-        <w:spacing w:before="0" w:after="80" w:line="300" w:lineRule="auto"/>
-      </w:pPr>
-      <w:r>
-        <w:rPr>
-          <w:rFonts w:ascii="Calibri" w:hAnsi="Calibri" w:eastAsia="Calibri"/>
-        </w:rPr>
-        <w:t>множественный выбор аудио/видео;</w:t>
-      </w:r>
-    </w:p>
-    <w:p>
-      <w:pPr>
-        <w:numPr>
-          <w:ilvl w:val="0"/>
-          <w:numId w:val="47"/>
-        </w:numPr>
-        <w:spacing w:before="0" w:after="80" w:line="300" w:lineRule="auto"/>
-      </w:pPr>
-      <w:r>
-        <w:rPr>
-          <w:rFonts w:ascii="Calibri" w:hAnsi="Calibri" w:eastAsia="Calibri"/>
-        </w:rPr>
-        <w:t>последовательная очередь;</w:t>
-      </w:r>
-    </w:p>
-    <w:p>
-      <w:pPr>
-        <w:numPr>
-          <w:ilvl w:val="0"/>
-          <w:numId w:val="47"/>
-        </w:numPr>
-        <w:spacing w:before="0" w:after="80" w:line="300" w:lineRule="auto"/>
-      </w:pPr>
-      <w:r>
-        <w:rPr>
-          <w:rFonts w:ascii="Calibri" w:hAnsi="Calibri" w:eastAsia="Calibri"/>
-        </w:rPr>
-        <w:t>Auto/RU/EN/ZH для распознавания;</w:t>
-      </w:r>
-    </w:p>
-    <w:p>
-      <w:pPr>
-        <w:numPr>
-          <w:ilvl w:val="0"/>
-          <w:numId w:val="47"/>
-        </w:numPr>
-        <w:spacing w:before="0" w:after="80" w:line="300" w:lineRule="auto"/>
-      </w:pPr>
-      <w:r>
-        <w:rPr>
-          <w:rFonts w:ascii="Calibri" w:hAnsi="Calibri" w:eastAsia="Calibri"/>
-        </w:rPr>
-        <w:t>прогресс и ETA;</w:t>
-      </w:r>
-    </w:p>
-    <w:p>
-      <w:pPr>
-        <w:numPr>
-          <w:ilvl w:val="0"/>
-          <w:numId w:val="47"/>
-        </w:numPr>
-        <w:spacing w:before="0" w:after="80" w:line="300" w:lineRule="auto"/>
-      </w:pPr>
-      <w:r>
-        <w:rPr>
-          <w:rFonts w:ascii="Calibri" w:hAnsi="Calibri" w:eastAsia="Calibri"/>
-        </w:rPr>
-        <w:t>persisted history завершённых и failed-заданий;</w:t>
-      </w:r>
-    </w:p>
-    <w:p>
-      <w:pPr>
-        <w:numPr>
-          <w:ilvl w:val="0"/>
-          <w:numId w:val="47"/>
-        </w:numPr>
-        <w:spacing w:before="0" w:after="80" w:line="300" w:lineRule="auto"/>
-      </w:pPr>
-      <w:r>
-        <w:rPr>
-          <w:rFonts w:ascii="Calibri" w:hAnsi="Calibri" w:eastAsia="Calibri"/>
-        </w:rPr>
-        <w:t>открытие транскрипта;</w:t>
-      </w:r>
-    </w:p>
-    <w:p>
-      <w:pPr>
-        <w:numPr>
-          <w:ilvl w:val="0"/>
-          <w:numId w:val="47"/>
-        </w:numPr>
-        <w:spacing w:before="0" w:after="80" w:line="300" w:lineRule="auto"/>
-      </w:pPr>
-      <w:r>
-        <w:rPr>
-          <w:rFonts w:ascii="Calibri" w:hAnsi="Calibri" w:eastAsia="Calibri"/>
-        </w:rPr>
-        <w:t>удаление элемента и transcript-файла;</w:t>
-      </w:r>
-    </w:p>
-    <w:p>
-      <w:pPr>
-        <w:numPr>
-          <w:ilvl w:val="0"/>
-          <w:numId w:val="47"/>
-        </w:numPr>
-        <w:spacing w:before="0" w:after="80" w:line="300" w:lineRule="auto"/>
-      </w:pPr>
-      <w:r>
-        <w:rPr>
-          <w:rFonts w:ascii="Calibri" w:hAnsi="Calibri" w:eastAsia="Calibri"/>
-        </w:rPr>
-        <w:t>встроенный текстовый редактор;</w:t>
-      </w:r>
-    </w:p>
-    <w:p>
-      <w:pPr>
-        <w:numPr>
-          <w:ilvl w:val="0"/>
-          <w:numId w:val="47"/>
-        </w:numPr>
-        <w:spacing w:before="0" w:after="80" w:line="300" w:lineRule="auto"/>
-      </w:pPr>
-      <w:r>
-        <w:rPr>
-          <w:rFonts w:ascii="Calibri" w:hAnsi="Calibri" w:eastAsia="Calibri"/>
-        </w:rPr>
-        <w:t>Copy all, Save TXT и Save JSON.</w:t>
-      </w:r>
-    </w:p>
-    <w:p>
-      <w:r>
-        <w:rPr>
-          <w:rFonts w:ascii="Calibri" w:hAnsi="Calibri" w:eastAsia="Calibri"/>
-        </w:rPr>
-        <w:t>В Linux/Windows пока отсутствуют или существенно упрощены:</w:t>
+        <w:t xml:space="preserve">Staging незавершённых записей: </w:t>
+      </w:r>
+      <w:r>
+        <w:rPr>
+          <w:rFonts w:ascii="Menlo" w:hAnsi="Menlo" w:eastAsia="Menlo"/>
+          <w:color w:val="1F4D78"/>
+          <w:sz w:val="21"/>
+          <w:shd w:fill="EDF1F5"/>
+        </w:rPr>
+        <w:t>~/Library/Application Support/GZWhisper/recording-sessions/in-progress/</w:t>
+      </w:r>
+      <w:r>
+        <w:rPr>
+          <w:rFonts w:ascii="Calibri" w:hAnsi="Calibri" w:eastAsia="Calibri"/>
+        </w:rPr>
+        <w:t>.</w:t>
+      </w:r>
+    </w:p>
+    <w:p>
+      <w:r>
+        <w:rPr>
+          <w:rFonts w:ascii="Calibri" w:hAnsi="Calibri" w:eastAsia="Calibri"/>
+        </w:rPr>
+        <w:t xml:space="preserve">Пользователь может выбрать другую папку при скачивании модели, но папка транскриптов по текущей реализации остаётся внутри стандартного </w:t>
+      </w:r>
+      <w:r>
+        <w:rPr>
+          <w:rFonts w:ascii="Menlo" w:hAnsi="Menlo" w:eastAsia="Menlo"/>
+          <w:color w:val="1F4D78"/>
+          <w:sz w:val="21"/>
+          <w:shd w:fill="EDF1F5"/>
+        </w:rPr>
+        <w:t>~/Documents/GZWhisper</w:t>
+      </w:r>
+      <w:r>
+        <w:rPr>
+          <w:rFonts w:ascii="Calibri" w:hAnsi="Calibri" w:eastAsia="Calibri"/>
+        </w:rPr>
+        <w:t>.</w:t>
+      </w:r>
+    </w:p>
+    <w:p>
+      <w:pPr>
+        <w:pStyle w:val="Heading2"/>
+      </w:pPr>
+      <w:r>
+        <w:rPr>
+          <w:rFonts w:ascii="Calibri" w:hAnsi="Calibri" w:eastAsia="Calibri"/>
+          <w:color w:val="2E74B5"/>
+          <w:sz w:val="26"/>
+        </w:rPr>
+        <w:t>12.3. Сохранение истории</w:t>
+      </w:r>
+    </w:p>
+    <w:p>
+      <w:r>
+        <w:rPr>
+          <w:rFonts w:ascii="Calibri" w:hAnsi="Calibri" w:eastAsia="Calibri"/>
+        </w:rPr>
+        <w:t>История хранится как локальный JSON. Между запусками сохраняются завершённые, failed и имеющие артефакты элементы, а также queued-записи. Чисто временные импортированные элементы без результата не обязаны сохраняться. Если приложение завершилось во время обработки сохранённой аудиозаписи, при следующем запуске такой элемент возвращается в очередь; неподкреплённый аудиоартефактом processing-элемент помечается failed.</w:t>
+      </w:r>
+    </w:p>
+    <w:p>
+      <w:pPr>
+        <w:pStyle w:val="Heading1"/>
+      </w:pPr>
+      <w:r>
+        <w:rPr>
+          <w:rFonts w:ascii="Calibri" w:hAnsi="Calibri" w:eastAsia="Calibri"/>
+          <w:color w:val="2E74B5"/>
+          <w:sz w:val="32"/>
+        </w:rPr>
+        <w:t>13. Функциональность Linux/Windows относительно macOS</w:t>
+      </w:r>
+    </w:p>
+    <w:p>
+      <w:r>
+        <w:rPr>
+          <w:rFonts w:ascii="Calibri" w:hAnsi="Calibri" w:eastAsia="Calibri"/>
+        </w:rPr>
+        <w:t>В Linux/Windows уже есть:</w:t>
       </w:r>
     </w:p>
     <w:p>
@@ -5549,7 +5443,7 @@
         <w:rPr>
           <w:rFonts w:ascii="Calibri" w:hAnsi="Calibri" w:eastAsia="Calibri"/>
         </w:rPr>
-        <w:t>запись системного звука и микрофона;</w:t>
+        <w:t>автоматическая локализация RU/EN/ZH;</w:t>
       </w:r>
     </w:p>
     <w:p>
@@ -5564,7 +5458,7 @@
         <w:rPr>
           <w:rFonts w:ascii="Calibri" w:hAnsi="Calibri" w:eastAsia="Calibri"/>
         </w:rPr>
-        <w:t>recording HUD и аварийное восстановление записи;</w:t>
+        <w:t>скачивание одной из двух моделей-кандидатов и отображение прогресса;</w:t>
       </w:r>
     </w:p>
     <w:p>
@@ -5579,7 +5473,7 @@
         <w:rPr>
           <w:rFonts w:ascii="Calibri" w:hAnsi="Calibri" w:eastAsia="Calibri"/>
         </w:rPr>
-        <w:t>drag-and-drop;</w:t>
+        <w:t>подключение и валидация локальной faster-whisper-модели;</w:t>
       </w:r>
     </w:p>
     <w:p>
@@ -5594,7 +5488,7 @@
         <w:rPr>
           <w:rFonts w:ascii="Calibri" w:hAnsi="Calibri" w:eastAsia="Calibri"/>
         </w:rPr>
-        <w:t>полнотекстовый поиск истории;</w:t>
+        <w:t>открытие папки модели;</w:t>
       </w:r>
     </w:p>
     <w:p>
@@ -5609,7 +5503,7 @@
         <w:rPr>
           <w:rFonts w:ascii="Calibri" w:hAnsi="Calibri" w:eastAsia="Calibri"/>
         </w:rPr>
-        <w:t>inline-переименование;</w:t>
+        <w:t>удаление скачанной модели или отвязка внешней;</w:t>
       </w:r>
     </w:p>
     <w:p>
@@ -5624,7 +5518,7 @@
         <w:rPr>
           <w:rFonts w:ascii="Calibri" w:hAnsi="Calibri" w:eastAsia="Calibri"/>
         </w:rPr>
-        <w:t>бейджи audio/transcript;</w:t>
+        <w:t>множественный выбор аудио/видео;</w:t>
       </w:r>
     </w:p>
     <w:p>
@@ -5639,7 +5533,7 @@
         <w:rPr>
           <w:rFonts w:ascii="Calibri" w:hAnsi="Calibri" w:eastAsia="Calibri"/>
         </w:rPr>
-        <w:t>просмотр сохранённой аудиозаписи;</w:t>
+        <w:t>последовательная очередь;</w:t>
       </w:r>
     </w:p>
     <w:p>
@@ -5654,7 +5548,7 @@
         <w:rPr>
           <w:rFonts w:ascii="Calibri" w:hAnsi="Calibri" w:eastAsia="Calibri"/>
         </w:rPr>
-        <w:t>запуск выделенного поднабора истории;</w:t>
+        <w:t>Auto/RU/EN/ZH для распознавания;</w:t>
       </w:r>
     </w:p>
     <w:p>
@@ -5669,7 +5563,7 @@
         <w:rPr>
           <w:rFonts w:ascii="Calibri" w:hAnsi="Calibri" w:eastAsia="Calibri"/>
         </w:rPr>
-        <w:t>ручная сортировка очереди;</w:t>
+        <w:t>прогресс и ETA;</w:t>
       </w:r>
     </w:p>
     <w:p>
@@ -5684,7 +5578,7 @@
         <w:rPr>
           <w:rFonts w:ascii="Calibri" w:hAnsi="Calibri" w:eastAsia="Calibri"/>
         </w:rPr>
-        <w:t>Pause after current, Resume, Skip current, Cancel queue и Clear queue как отдельные развитые действия;</w:t>
+        <w:t>persisted history завершённых и failed-заданий;</w:t>
       </w:r>
     </w:p>
     <w:p>
@@ -5699,7 +5593,7 @@
         <w:rPr>
           <w:rFonts w:ascii="Calibri" w:hAnsi="Calibri" w:eastAsia="Calibri"/>
         </w:rPr>
-        <w:t>15-секундный Undo и перенос в Trash;</w:t>
+        <w:t>открытие транскрипта;</w:t>
       </w:r>
     </w:p>
     <w:p>
@@ -5714,7 +5608,7 @@
         <w:rPr>
           <w:rFonts w:ascii="Calibri" w:hAnsi="Calibri" w:eastAsia="Calibri"/>
         </w:rPr>
-        <w:t>responsive SwiftUI-компоновка;</w:t>
+        <w:t>удаление элемента и transcript-файла;</w:t>
       </w:r>
     </w:p>
     <w:p>
@@ -5729,41 +5623,30 @@
         <w:rPr>
           <w:rFonts w:ascii="Calibri" w:hAnsi="Calibri" w:eastAsia="Calibri"/>
         </w:rPr>
-        <w:t>расширенная debug-панель.</w:t>
-      </w:r>
-    </w:p>
-    <w:p>
-      <w:pPr>
-        <w:pStyle w:val="Heading1"/>
-      </w:pPr>
-      <w:r>
-        <w:rPr>
-          <w:rFonts w:ascii="Calibri" w:hAnsi="Calibri" w:eastAsia="Calibri"/>
-          <w:color w:val="2E74B5"/>
-          <w:sz w:val="32"/>
-        </w:rPr>
-        <w:t>14. Существенные ограничения текущего продукта</w:t>
-      </w:r>
-    </w:p>
-    <w:p>
-      <w:r>
-        <w:rPr>
-          <w:rFonts w:ascii="Calibri" w:hAnsi="Calibri" w:eastAsia="Calibri"/>
-        </w:rPr>
-        <w:t xml:space="preserve">Следующие возможности в текущей реализации </w:t>
-      </w:r>
-      <w:r>
-        <w:rPr>
-          <w:rFonts w:ascii="Calibri" w:hAnsi="Calibri" w:eastAsia="Calibri"/>
-          <w:b/>
-        </w:rPr>
-        <w:t>не обнаружены</w:t>
-      </w:r>
-      <w:r>
-        <w:rPr>
-          <w:rFonts w:ascii="Calibri" w:hAnsi="Calibri" w:eastAsia="Calibri"/>
-        </w:rPr>
-        <w:t xml:space="preserve"> и не должны ошибочно считаться существующими:</w:t>
+        <w:t>встроенный текстовый редактор;</w:t>
+      </w:r>
+    </w:p>
+    <w:p>
+      <w:pPr>
+        <w:numPr>
+          <w:ilvl w:val="0"/>
+          <w:numId w:val="48"/>
+        </w:numPr>
+        <w:spacing w:before="0" w:after="80" w:line="300" w:lineRule="auto"/>
+      </w:pPr>
+      <w:r>
+        <w:rPr>
+          <w:rFonts w:ascii="Calibri" w:hAnsi="Calibri" w:eastAsia="Calibri"/>
+        </w:rPr>
+        <w:t>Copy all, Save TXT и Save JSON.</w:t>
+      </w:r>
+    </w:p>
+    <w:p>
+      <w:r>
+        <w:rPr>
+          <w:rFonts w:ascii="Calibri" w:hAnsi="Calibri" w:eastAsia="Calibri"/>
+        </w:rPr>
+        <w:t>В Linux/Windows пока отсутствуют или существенно упрощены:</w:t>
       </w:r>
     </w:p>
     <w:p>
@@ -5778,7 +5661,7 @@
         <w:rPr>
           <w:rFonts w:ascii="Calibri" w:hAnsi="Calibri" w:eastAsia="Calibri"/>
         </w:rPr>
-        <w:t>live-транскрибация текста во время записи;</w:t>
+        <w:t>запись системного звука и микрофона;</w:t>
       </w:r>
     </w:p>
     <w:p>
@@ -5793,7 +5676,7 @@
         <w:rPr>
           <w:rFonts w:ascii="Calibri" w:hAnsi="Calibri" w:eastAsia="Calibri"/>
         </w:rPr>
-        <w:t>потоковый показ частичного текста до завершения файла;</w:t>
+        <w:t>recording HUD и аварийное восстановление записи;</w:t>
       </w:r>
     </w:p>
     <w:p>
@@ -5808,7 +5691,7 @@
         <w:rPr>
           <w:rFonts w:ascii="Calibri" w:hAnsi="Calibri" w:eastAsia="Calibri"/>
         </w:rPr>
-        <w:t>speaker diarization и автоматическое разделение спикеров;</w:t>
+        <w:t>drag-and-drop;</w:t>
       </w:r>
     </w:p>
     <w:p>
@@ -5823,7 +5706,7 @@
         <w:rPr>
           <w:rFonts w:ascii="Calibri" w:hAnsi="Calibri" w:eastAsia="Calibri"/>
         </w:rPr>
-        <w:t>распознавание/назначение имён спикерам;</w:t>
+        <w:t>полнотекстовый поиск истории;</w:t>
       </w:r>
     </w:p>
     <w:p>
@@ -5838,7 +5721,7 @@
         <w:rPr>
           <w:rFonts w:ascii="Calibri" w:hAnsi="Calibri" w:eastAsia="Calibri"/>
         </w:rPr>
-        <w:t>word-level timestamps;</w:t>
+        <w:t>inline-переименование;</w:t>
       </w:r>
     </w:p>
     <w:p>
@@ -5853,7 +5736,7 @@
         <w:rPr>
           <w:rFonts w:ascii="Calibri" w:hAnsi="Calibri" w:eastAsia="Calibri"/>
         </w:rPr>
-        <w:t>интерактивный timeline, синхронизация текста с аудио и переход по таймкоду;</w:t>
+        <w:t>бейджи audio/transcript;</w:t>
       </w:r>
     </w:p>
     <w:p>
@@ -5868,7 +5751,7 @@
         <w:rPr>
           <w:rFonts w:ascii="Calibri" w:hAnsi="Calibri" w:eastAsia="Calibri"/>
         </w:rPr>
-        <w:t>встроенный аудиоплеер;</w:t>
+        <w:t>просмотр сохранённой аудиозаписи;</w:t>
       </w:r>
     </w:p>
     <w:p>
@@ -5883,7 +5766,7 @@
         <w:rPr>
           <w:rFonts w:ascii="Calibri" w:hAnsi="Calibri" w:eastAsia="Calibri"/>
         </w:rPr>
-        <w:t>редактирование аудио, обрезка, удаление пауз или шумоподавление как отдельные инструменты;</w:t>
+        <w:t>запуск выделенного поднабора истории;</w:t>
       </w:r>
     </w:p>
     <w:p>
@@ -5898,7 +5781,7 @@
         <w:rPr>
           <w:rFonts w:ascii="Calibri" w:hAnsi="Calibri" w:eastAsia="Calibri"/>
         </w:rPr>
-        <w:t>экспорт SRT, VTT, DOCX, PDF, CSV, Markdown или Final Cut/Premiere formats;</w:t>
+        <w:t>ручная сортировка очереди;</w:t>
       </w:r>
     </w:p>
     <w:p>
@@ -5913,7 +5796,7 @@
         <w:rPr>
           <w:rFonts w:ascii="Calibri" w:hAnsi="Calibri" w:eastAsia="Calibri"/>
         </w:rPr>
-        <w:t>сохранение сегментов в history для повторного JSON/SRT-экспорта;</w:t>
+        <w:t>Pause after current, Resume, Skip current, Cancel queue и Clear queue как отдельные развитые действия;</w:t>
       </w:r>
     </w:p>
     <w:p>
@@ -5928,7 +5811,7 @@
         <w:rPr>
           <w:rFonts w:ascii="Calibri" w:hAnsi="Calibri" w:eastAsia="Calibri"/>
         </w:rPr>
-        <w:t>автоматические summary, chapters, action items, meeting notes или темы;</w:t>
+        <w:t>15-секундный Undo и перенос в Trash;</w:t>
       </w:r>
     </w:p>
     <w:p>
@@ -5943,7 +5826,7 @@
         <w:rPr>
           <w:rFonts w:ascii="Calibri" w:hAnsi="Calibri" w:eastAsia="Calibri"/>
         </w:rPr>
-        <w:t>перевод транскрипта;</w:t>
+        <w:t>responsive SwiftUI-компоновка;</w:t>
       </w:r>
     </w:p>
     <w:p>
@@ -5958,277 +5841,7 @@
         <w:rPr>
           <w:rFonts w:ascii="Calibri" w:hAnsi="Calibri" w:eastAsia="Calibri"/>
         </w:rPr>
-        <w:t>пользовательский словарь, vocabulary hints, prompt или коррекция терминов;</w:t>
-      </w:r>
-    </w:p>
-    <w:p>
-      <w:pPr>
-        <w:numPr>
-          <w:ilvl w:val="0"/>
-          <w:numId w:val="49"/>
-        </w:numPr>
-        <w:spacing w:before="0" w:after="80" w:line="300" w:lineRule="auto"/>
-      </w:pPr>
-      <w:r>
-        <w:rPr>
-          <w:rFonts w:ascii="Calibri" w:hAnsi="Calibri" w:eastAsia="Calibri"/>
-        </w:rPr>
-        <w:t>выбор из каталога моделей, управление несколькими моделями или профили качества/скорости;</w:t>
-      </w:r>
-    </w:p>
-    <w:p>
-      <w:pPr>
-        <w:numPr>
-          <w:ilvl w:val="0"/>
-          <w:numId w:val="49"/>
-        </w:numPr>
-        <w:spacing w:before="0" w:after="80" w:line="300" w:lineRule="auto"/>
-      </w:pPr>
-      <w:r>
-        <w:rPr>
-          <w:rFonts w:ascii="Calibri" w:hAnsi="Calibri" w:eastAsia="Calibri"/>
-        </w:rPr>
-        <w:t>настройка VAD, beam size, compute type, CPU/GPU и batch size;</w:t>
-      </w:r>
-    </w:p>
-    <w:p>
-      <w:pPr>
-        <w:numPr>
-          <w:ilvl w:val="0"/>
-          <w:numId w:val="49"/>
-        </w:numPr>
-        <w:spacing w:before="0" w:after="80" w:line="300" w:lineRule="auto"/>
-      </w:pPr>
-      <w:r>
-        <w:rPr>
-          <w:rFonts w:ascii="Calibri" w:hAnsi="Calibri" w:eastAsia="Calibri"/>
-        </w:rPr>
-        <w:t>одновременная параллельная транскрибация нескольких файлов;</w:t>
-      </w:r>
-    </w:p>
-    <w:p>
-      <w:pPr>
-        <w:numPr>
-          <w:ilvl w:val="0"/>
-          <w:numId w:val="49"/>
-        </w:numPr>
-        <w:spacing w:before="0" w:after="80" w:line="300" w:lineRule="auto"/>
-      </w:pPr>
-      <w:r>
-        <w:rPr>
-          <w:rFonts w:ascii="Calibri" w:hAnsi="Calibri" w:eastAsia="Calibri"/>
-        </w:rPr>
-        <w:t>глобальная горячая клавиша записи, menu bar mode или управление из системного меню;</w:t>
-      </w:r>
-    </w:p>
-    <w:p>
-      <w:pPr>
-        <w:numPr>
-          <w:ilvl w:val="0"/>
-          <w:numId w:val="49"/>
-        </w:numPr>
-        <w:spacing w:before="0" w:after="80" w:line="300" w:lineRule="auto"/>
-      </w:pPr>
-      <w:r>
-        <w:rPr>
-          <w:rFonts w:ascii="Calibri" w:hAnsi="Calibri" w:eastAsia="Calibri"/>
-        </w:rPr>
-        <w:t>календарь, meeting bot, подключение к Zoom/Teams/Google Meet или автоматический вход на встречи;</w:t>
-      </w:r>
-    </w:p>
-    <w:p>
-      <w:pPr>
-        <w:numPr>
-          <w:ilvl w:val="0"/>
-          <w:numId w:val="49"/>
-        </w:numPr>
-        <w:spacing w:before="0" w:after="80" w:line="300" w:lineRule="auto"/>
-      </w:pPr>
-      <w:r>
-        <w:rPr>
-          <w:rFonts w:ascii="Calibri" w:hAnsi="Calibri" w:eastAsia="Calibri"/>
-        </w:rPr>
-        <w:t>импорт URL с YouTube, подкастов или облачных дисков;</w:t>
-      </w:r>
-    </w:p>
-    <w:p>
-      <w:pPr>
-        <w:numPr>
-          <w:ilvl w:val="0"/>
-          <w:numId w:val="49"/>
-        </w:numPr>
-        <w:spacing w:before="0" w:after="80" w:line="300" w:lineRule="auto"/>
-      </w:pPr>
-      <w:r>
-        <w:rPr>
-          <w:rFonts w:ascii="Calibri" w:hAnsi="Calibri" w:eastAsia="Calibri"/>
-        </w:rPr>
-        <w:t>watch folders и автоматическая обработка новых файлов;</w:t>
-      </w:r>
-    </w:p>
-    <w:p>
-      <w:pPr>
-        <w:numPr>
-          <w:ilvl w:val="0"/>
-          <w:numId w:val="49"/>
-        </w:numPr>
-        <w:spacing w:before="0" w:after="80" w:line="300" w:lineRule="auto"/>
-      </w:pPr>
-      <w:r>
-        <w:rPr>
-          <w:rFonts w:ascii="Calibri" w:hAnsi="Calibri" w:eastAsia="Calibri"/>
-        </w:rPr>
-        <w:t>облачная синхронизация, совместная работа, комментарии и расшаривание;</w:t>
-      </w:r>
-    </w:p>
-    <w:p>
-      <w:pPr>
-        <w:numPr>
-          <w:ilvl w:val="0"/>
-          <w:numId w:val="49"/>
-        </w:numPr>
-        <w:spacing w:before="0" w:after="80" w:line="300" w:lineRule="auto"/>
-      </w:pPr>
-      <w:r>
-        <w:rPr>
-          <w:rFonts w:ascii="Calibri" w:hAnsi="Calibri" w:eastAsia="Calibri"/>
-        </w:rPr>
-        <w:t>мобильные или web-клиенты;</w:t>
-      </w:r>
-    </w:p>
-    <w:p>
-      <w:pPr>
-        <w:numPr>
-          <w:ilvl w:val="0"/>
-          <w:numId w:val="49"/>
-        </w:numPr>
-        <w:spacing w:before="0" w:after="80" w:line="300" w:lineRule="auto"/>
-      </w:pPr>
-      <w:r>
-        <w:rPr>
-          <w:rFonts w:ascii="Calibri" w:hAnsi="Calibri" w:eastAsia="Calibri"/>
-        </w:rPr>
-        <w:t>аккаунты, команды, роли, биллинг и подписки;</w:t>
-      </w:r>
-    </w:p>
-    <w:p>
-      <w:pPr>
-        <w:numPr>
-          <w:ilvl w:val="0"/>
-          <w:numId w:val="49"/>
-        </w:numPr>
-        <w:spacing w:before="0" w:after="80" w:line="300" w:lineRule="auto"/>
-      </w:pPr>
-      <w:r>
-        <w:rPr>
-          <w:rFonts w:ascii="Calibri" w:hAnsi="Calibri" w:eastAsia="Calibri"/>
-        </w:rPr>
-        <w:t>автоматическое обновление приложения;</w:t>
-      </w:r>
-    </w:p>
-    <w:p>
-      <w:pPr>
-        <w:numPr>
-          <w:ilvl w:val="0"/>
-          <w:numId w:val="49"/>
-        </w:numPr>
-        <w:spacing w:before="0" w:after="80" w:line="300" w:lineRule="auto"/>
-      </w:pPr>
-      <w:r>
-        <w:rPr>
-          <w:rFonts w:ascii="Calibri" w:hAnsi="Calibri" w:eastAsia="Calibri"/>
-        </w:rPr>
-        <w:t>встроенная анонимизация/редакция чувствительных данных;</w:t>
-      </w:r>
-    </w:p>
-    <w:p>
-      <w:pPr>
-        <w:numPr>
-          <w:ilvl w:val="0"/>
-          <w:numId w:val="49"/>
-        </w:numPr>
-        <w:spacing w:before="0" w:after="80" w:line="300" w:lineRule="auto"/>
-      </w:pPr>
-      <w:r>
-        <w:rPr>
-          <w:rFonts w:ascii="Calibri" w:hAnsi="Calibri" w:eastAsia="Calibri"/>
-        </w:rPr>
-        <w:t>шифрование локальной библиотеки на уровне самого приложения;</w:t>
-      </w:r>
-    </w:p>
-    <w:p>
-      <w:pPr>
-        <w:numPr>
-          <w:ilvl w:val="0"/>
-          <w:numId w:val="49"/>
-        </w:numPr>
-        <w:spacing w:before="0" w:after="80" w:line="300" w:lineRule="auto"/>
-      </w:pPr>
-      <w:r>
-        <w:rPr>
-          <w:rFonts w:ascii="Calibri" w:hAnsi="Calibri" w:eastAsia="Calibri"/>
-        </w:rPr>
-        <w:t>поиск по семантике/эмбеддингам, чат с транскриптами или RAG;</w:t>
-      </w:r>
-    </w:p>
-    <w:p>
-      <w:pPr>
-        <w:numPr>
-          <w:ilvl w:val="0"/>
-          <w:numId w:val="49"/>
-        </w:numPr>
-        <w:spacing w:before="0" w:after="80" w:line="300" w:lineRule="auto"/>
-      </w:pPr>
-      <w:r>
-        <w:rPr>
-          <w:rFonts w:ascii="Calibri" w:hAnsi="Calibri" w:eastAsia="Calibri"/>
-        </w:rPr>
-        <w:t>массовый экспорт и пакетное переименование;</w:t>
-      </w:r>
-    </w:p>
-    <w:p>
-      <w:pPr>
-        <w:numPr>
-          <w:ilvl w:val="0"/>
-          <w:numId w:val="49"/>
-        </w:numPr>
-        <w:spacing w:before="0" w:after="80" w:line="300" w:lineRule="auto"/>
-      </w:pPr>
-      <w:r>
-        <w:rPr>
-          <w:rFonts w:ascii="Calibri" w:hAnsi="Calibri" w:eastAsia="Calibri"/>
-        </w:rPr>
-        <w:t>ручной переключатель языка интерфейса;</w:t>
-      </w:r>
-    </w:p>
-    <w:p>
-      <w:pPr>
-        <w:numPr>
-          <w:ilvl w:val="0"/>
-          <w:numId w:val="49"/>
-        </w:numPr>
-        <w:spacing w:before="0" w:after="80" w:line="300" w:lineRule="auto"/>
-      </w:pPr>
-      <w:r>
-        <w:rPr>
-          <w:rFonts w:ascii="Calibri" w:hAnsi="Calibri" w:eastAsia="Calibri"/>
-        </w:rPr>
-        <w:t>полноценная поддержка Intel Mac;</w:t>
-      </w:r>
-    </w:p>
-    <w:p>
-      <w:pPr>
-        <w:numPr>
-          <w:ilvl w:val="0"/>
-          <w:numId w:val="49"/>
-        </w:numPr>
-        <w:spacing w:before="0" w:after="80" w:line="300" w:lineRule="auto"/>
-      </w:pPr>
-      <w:r>
-        <w:rPr>
-          <w:rFonts w:ascii="Calibri" w:hAnsi="Calibri" w:eastAsia="Calibri"/>
-        </w:rPr>
-        <w:t>гарантированная Apple notarization публичных сборок.</w:t>
+        <w:t>расширенная debug-панель.</w:t>
       </w:r>
     </w:p>
     <w:p>
@@ -6241,15 +5854,28 @@
           <w:color w:val="2E74B5"/>
           <w:sz w:val="32"/>
         </w:rPr>
-        <w:t>15. Сильные стороны, которые важно не потерять при заимствовании идей</w:t>
-      </w:r>
-    </w:p>
-    <w:p>
-      <w:r>
-        <w:rPr>
-          <w:rFonts w:ascii="Calibri" w:hAnsi="Calibri" w:eastAsia="Calibri"/>
-        </w:rPr>
-        <w:t>При оценке функций конкурентов следует считать базовыми принципами GZWhisper:</w:t>
+        <w:t>14. Существенные ограничения текущего продукта</w:t>
+      </w:r>
+    </w:p>
+    <w:p>
+      <w:r>
+        <w:rPr>
+          <w:rFonts w:ascii="Calibri" w:hAnsi="Calibri" w:eastAsia="Calibri"/>
+        </w:rPr>
+        <w:t xml:space="preserve">Следующие возможности в текущей реализации </w:t>
+      </w:r>
+      <w:r>
+        <w:rPr>
+          <w:rFonts w:ascii="Calibri" w:hAnsi="Calibri" w:eastAsia="Calibri"/>
+          <w:b/>
+        </w:rPr>
+        <w:t>не обнаружены</w:t>
+      </w:r>
+      <w:r>
+        <w:rPr>
+          <w:rFonts w:ascii="Calibri" w:hAnsi="Calibri" w:eastAsia="Calibri"/>
+        </w:rPr>
+        <w:t xml:space="preserve"> и не должны ошибочно считаться существующими:</w:t>
       </w:r>
     </w:p>
     <w:p>
@@ -6263,15 +5889,8 @@
       <w:r>
         <w:rPr>
           <w:rFonts w:ascii="Calibri" w:hAnsi="Calibri" w:eastAsia="Calibri"/>
-          <w:b/>
-        </w:rPr>
-        <w:t>Local-first:</w:t>
-      </w:r>
-      <w:r>
-        <w:rPr>
-          <w:rFonts w:ascii="Calibri" w:hAnsi="Calibri" w:eastAsia="Calibri"/>
-        </w:rPr>
-        <w:t xml:space="preserve"> основной контент пользователя остаётся на его компьютере.</w:t>
+        </w:rPr>
+        <w:t>live-транскрибация текста во время записи;</w:t>
       </w:r>
     </w:p>
     <w:p>
@@ -6285,15 +5904,8 @@
       <w:r>
         <w:rPr>
           <w:rFonts w:ascii="Calibri" w:hAnsi="Calibri" w:eastAsia="Calibri"/>
-          <w:b/>
-        </w:rPr>
-        <w:t>Отсутствие обязательного аккаунта:</w:t>
-      </w:r>
-      <w:r>
-        <w:rPr>
-          <w:rFonts w:ascii="Calibri" w:hAnsi="Calibri" w:eastAsia="Calibri"/>
-        </w:rPr>
-        <w:t xml:space="preserve"> быстрый старт и независимость от облачного сервиса.</w:t>
+        </w:rPr>
+        <w:t>потоковый показ частичного текста до завершения файла;</w:t>
       </w:r>
     </w:p>
     <w:p>
@@ -6307,15 +5919,8 @@
       <w:r>
         <w:rPr>
           <w:rFonts w:ascii="Calibri" w:hAnsi="Calibri" w:eastAsia="Calibri"/>
-          <w:b/>
-        </w:rPr>
-        <w:t>Предсказуемое владение файлами:</w:t>
-      </w:r>
-      <w:r>
-        <w:rPr>
-          <w:rFonts w:ascii="Calibri" w:hAnsi="Calibri" w:eastAsia="Calibri"/>
-        </w:rPr>
-        <w:t xml:space="preserve"> обычные TXT, JSON и M4A доступны вне приложения.</w:t>
+        </w:rPr>
+        <w:t>speaker diarization и автоматическое разделение спикеров;</w:t>
       </w:r>
     </w:p>
     <w:p>
@@ -6329,15 +5934,8 @@
       <w:r>
         <w:rPr>
           <w:rFonts w:ascii="Calibri" w:hAnsi="Calibri" w:eastAsia="Calibri"/>
-          <w:b/>
-        </w:rPr>
-        <w:t>Надёжность длительной записи:</w:t>
-      </w:r>
-      <w:r>
-        <w:rPr>
-          <w:rFonts w:ascii="Calibri" w:hAnsi="Calibri" w:eastAsia="Calibri"/>
-        </w:rPr>
-        <w:t xml:space="preserve"> staging, фрагментированные файлы, sleep/wake handling и single-track fallback.</w:t>
+        </w:rPr>
+        <w:t>распознавание/назначение имён спикерам;</w:t>
       </w:r>
     </w:p>
     <w:p>
@@ -6351,15 +5949,8 @@
       <w:r>
         <w:rPr>
           <w:rFonts w:ascii="Calibri" w:hAnsi="Calibri" w:eastAsia="Calibri"/>
-          <w:b/>
-        </w:rPr>
-        <w:t>Управляемая очередь:</w:t>
-      </w:r>
-      <w:r>
-        <w:rPr>
-          <w:rFonts w:ascii="Calibri" w:hAnsi="Calibri" w:eastAsia="Calibri"/>
-        </w:rPr>
-        <w:t xml:space="preserve"> пользователь контролирует порядок и может паузить, пропускать и отменять задания.</w:t>
+        </w:rPr>
+        <w:t>word-level timestamps;</w:t>
       </w:r>
     </w:p>
     <w:p>
@@ -6373,15 +5964,8 @@
       <w:r>
         <w:rPr>
           <w:rFonts w:ascii="Calibri" w:hAnsi="Calibri" w:eastAsia="Calibri"/>
-          <w:b/>
-        </w:rPr>
-        <w:t>Прозрачная модель:</w:t>
-      </w:r>
-      <w:r>
-        <w:rPr>
-          <w:rFonts w:ascii="Calibri" w:hAnsi="Calibri" w:eastAsia="Calibri"/>
-        </w:rPr>
-        <w:t xml:space="preserve"> видны её источник и папка; можно подключить свою локальную модель.</w:t>
+        </w:rPr>
+        <w:t>интерактивный timeline, синхронизация текста с аудио и переход по таймкоду;</w:t>
       </w:r>
     </w:p>
     <w:p>
@@ -6395,15 +5979,8 @@
       <w:r>
         <w:rPr>
           <w:rFonts w:ascii="Calibri" w:hAnsi="Calibri" w:eastAsia="Calibri"/>
-          <w:b/>
-        </w:rPr>
-        <w:t>Работа без тарификации по минутам:</w:t>
-      </w:r>
-      <w:r>
-        <w:rPr>
-          <w:rFonts w:ascii="Calibri" w:hAnsi="Calibri" w:eastAsia="Calibri"/>
-        </w:rPr>
-        <w:t xml:space="preserve"> после скачивания модели нет серверного счётчика обработки.</w:t>
+        </w:rPr>
+        <w:t>встроенный аудиоплеер;</w:t>
       </w:r>
     </w:p>
     <w:p>
@@ -6417,15 +5994,8 @@
       <w:r>
         <w:rPr>
           <w:rFonts w:ascii="Calibri" w:hAnsi="Calibri" w:eastAsia="Calibri"/>
-          <w:b/>
-        </w:rPr>
-        <w:t>macOS-native UX:</w:t>
-      </w:r>
-      <w:r>
-        <w:rPr>
-          <w:rFonts w:ascii="Calibri" w:hAnsi="Calibri" w:eastAsia="Calibri"/>
-        </w:rPr>
-        <w:t xml:space="preserve"> Finder, Trash/Undo, системные разрешения, light/dark mode, Spaces и компактный HUD.</w:t>
+        </w:rPr>
+        <w:t>редактирование аудио, обрезка, удаление пауз или шумоподавление как отдельные инструменты;</w:t>
       </w:r>
     </w:p>
     <w:p>
@@ -6439,6 +6009,548 @@
       <w:r>
         <w:rPr>
           <w:rFonts w:ascii="Calibri" w:hAnsi="Calibri" w:eastAsia="Calibri"/>
+        </w:rPr>
+        <w:t>экспорт SRT, VTT, DOCX, PDF, CSV, Markdown или Final Cut/Premiere formats;</w:t>
+      </w:r>
+    </w:p>
+    <w:p>
+      <w:pPr>
+        <w:numPr>
+          <w:ilvl w:val="0"/>
+          <w:numId w:val="50"/>
+        </w:numPr>
+        <w:spacing w:before="0" w:after="80" w:line="300" w:lineRule="auto"/>
+      </w:pPr>
+      <w:r>
+        <w:rPr>
+          <w:rFonts w:ascii="Calibri" w:hAnsi="Calibri" w:eastAsia="Calibri"/>
+        </w:rPr>
+        <w:t>сохранение сегментов в history для повторного JSON/SRT-экспорта;</w:t>
+      </w:r>
+    </w:p>
+    <w:p>
+      <w:pPr>
+        <w:numPr>
+          <w:ilvl w:val="0"/>
+          <w:numId w:val="50"/>
+        </w:numPr>
+        <w:spacing w:before="0" w:after="80" w:line="300" w:lineRule="auto"/>
+      </w:pPr>
+      <w:r>
+        <w:rPr>
+          <w:rFonts w:ascii="Calibri" w:hAnsi="Calibri" w:eastAsia="Calibri"/>
+        </w:rPr>
+        <w:t>автоматические summary, chapters, action items, meeting notes или темы;</w:t>
+      </w:r>
+    </w:p>
+    <w:p>
+      <w:pPr>
+        <w:numPr>
+          <w:ilvl w:val="0"/>
+          <w:numId w:val="50"/>
+        </w:numPr>
+        <w:spacing w:before="0" w:after="80" w:line="300" w:lineRule="auto"/>
+      </w:pPr>
+      <w:r>
+        <w:rPr>
+          <w:rFonts w:ascii="Calibri" w:hAnsi="Calibri" w:eastAsia="Calibri"/>
+        </w:rPr>
+        <w:t>перевод транскрипта;</w:t>
+      </w:r>
+    </w:p>
+    <w:p>
+      <w:pPr>
+        <w:numPr>
+          <w:ilvl w:val="0"/>
+          <w:numId w:val="50"/>
+        </w:numPr>
+        <w:spacing w:before="0" w:after="80" w:line="300" w:lineRule="auto"/>
+      </w:pPr>
+      <w:r>
+        <w:rPr>
+          <w:rFonts w:ascii="Calibri" w:hAnsi="Calibri" w:eastAsia="Calibri"/>
+        </w:rPr>
+        <w:t>пользовательский словарь, vocabulary hints, prompt или коррекция терминов;</w:t>
+      </w:r>
+    </w:p>
+    <w:p>
+      <w:pPr>
+        <w:numPr>
+          <w:ilvl w:val="0"/>
+          <w:numId w:val="50"/>
+        </w:numPr>
+        <w:spacing w:before="0" w:after="80" w:line="300" w:lineRule="auto"/>
+      </w:pPr>
+      <w:r>
+        <w:rPr>
+          <w:rFonts w:ascii="Calibri" w:hAnsi="Calibri" w:eastAsia="Calibri"/>
+        </w:rPr>
+        <w:t>выбор из каталога моделей, управление несколькими моделями или профили качества/скорости;</w:t>
+      </w:r>
+    </w:p>
+    <w:p>
+      <w:pPr>
+        <w:numPr>
+          <w:ilvl w:val="0"/>
+          <w:numId w:val="50"/>
+        </w:numPr>
+        <w:spacing w:before="0" w:after="80" w:line="300" w:lineRule="auto"/>
+      </w:pPr>
+      <w:r>
+        <w:rPr>
+          <w:rFonts w:ascii="Calibri" w:hAnsi="Calibri" w:eastAsia="Calibri"/>
+        </w:rPr>
+        <w:t>настройка VAD, beam size, compute type, CPU/GPU и batch size;</w:t>
+      </w:r>
+    </w:p>
+    <w:p>
+      <w:pPr>
+        <w:numPr>
+          <w:ilvl w:val="0"/>
+          <w:numId w:val="50"/>
+        </w:numPr>
+        <w:spacing w:before="0" w:after="80" w:line="300" w:lineRule="auto"/>
+      </w:pPr>
+      <w:r>
+        <w:rPr>
+          <w:rFonts w:ascii="Calibri" w:hAnsi="Calibri" w:eastAsia="Calibri"/>
+        </w:rPr>
+        <w:t>одновременная параллельная транскрибация нескольких файлов;</w:t>
+      </w:r>
+    </w:p>
+    <w:p>
+      <w:pPr>
+        <w:numPr>
+          <w:ilvl w:val="0"/>
+          <w:numId w:val="50"/>
+        </w:numPr>
+        <w:spacing w:before="0" w:after="80" w:line="300" w:lineRule="auto"/>
+      </w:pPr>
+      <w:r>
+        <w:rPr>
+          <w:rFonts w:ascii="Calibri" w:hAnsi="Calibri" w:eastAsia="Calibri"/>
+        </w:rPr>
+        <w:t>глобальная горячая клавиша записи, menu bar mode или управление из системного меню;</w:t>
+      </w:r>
+    </w:p>
+    <w:p>
+      <w:pPr>
+        <w:numPr>
+          <w:ilvl w:val="0"/>
+          <w:numId w:val="50"/>
+        </w:numPr>
+        <w:spacing w:before="0" w:after="80" w:line="300" w:lineRule="auto"/>
+      </w:pPr>
+      <w:r>
+        <w:rPr>
+          <w:rFonts w:ascii="Calibri" w:hAnsi="Calibri" w:eastAsia="Calibri"/>
+        </w:rPr>
+        <w:t>календарь, meeting bot, подключение к Zoom/Teams/Google Meet или автоматический вход на встречи;</w:t>
+      </w:r>
+    </w:p>
+    <w:p>
+      <w:pPr>
+        <w:numPr>
+          <w:ilvl w:val="0"/>
+          <w:numId w:val="50"/>
+        </w:numPr>
+        <w:spacing w:before="0" w:after="80" w:line="300" w:lineRule="auto"/>
+      </w:pPr>
+      <w:r>
+        <w:rPr>
+          <w:rFonts w:ascii="Calibri" w:hAnsi="Calibri" w:eastAsia="Calibri"/>
+        </w:rPr>
+        <w:t>импорт URL с YouTube, подкастов или облачных дисков;</w:t>
+      </w:r>
+    </w:p>
+    <w:p>
+      <w:pPr>
+        <w:numPr>
+          <w:ilvl w:val="0"/>
+          <w:numId w:val="50"/>
+        </w:numPr>
+        <w:spacing w:before="0" w:after="80" w:line="300" w:lineRule="auto"/>
+      </w:pPr>
+      <w:r>
+        <w:rPr>
+          <w:rFonts w:ascii="Calibri" w:hAnsi="Calibri" w:eastAsia="Calibri"/>
+        </w:rPr>
+        <w:t>watch folders и автоматическая обработка новых файлов;</w:t>
+      </w:r>
+    </w:p>
+    <w:p>
+      <w:pPr>
+        <w:numPr>
+          <w:ilvl w:val="0"/>
+          <w:numId w:val="50"/>
+        </w:numPr>
+        <w:spacing w:before="0" w:after="80" w:line="300" w:lineRule="auto"/>
+      </w:pPr>
+      <w:r>
+        <w:rPr>
+          <w:rFonts w:ascii="Calibri" w:hAnsi="Calibri" w:eastAsia="Calibri"/>
+        </w:rPr>
+        <w:t>облачная синхронизация, совместная работа, комментарии и расшаривание;</w:t>
+      </w:r>
+    </w:p>
+    <w:p>
+      <w:pPr>
+        <w:numPr>
+          <w:ilvl w:val="0"/>
+          <w:numId w:val="50"/>
+        </w:numPr>
+        <w:spacing w:before="0" w:after="80" w:line="300" w:lineRule="auto"/>
+      </w:pPr>
+      <w:r>
+        <w:rPr>
+          <w:rFonts w:ascii="Calibri" w:hAnsi="Calibri" w:eastAsia="Calibri"/>
+        </w:rPr>
+        <w:t>мобильные или web-клиенты;</w:t>
+      </w:r>
+    </w:p>
+    <w:p>
+      <w:pPr>
+        <w:numPr>
+          <w:ilvl w:val="0"/>
+          <w:numId w:val="50"/>
+        </w:numPr>
+        <w:spacing w:before="0" w:after="80" w:line="300" w:lineRule="auto"/>
+      </w:pPr>
+      <w:r>
+        <w:rPr>
+          <w:rFonts w:ascii="Calibri" w:hAnsi="Calibri" w:eastAsia="Calibri"/>
+        </w:rPr>
+        <w:t>аккаунты, команды, роли, биллинг и подписки;</w:t>
+      </w:r>
+    </w:p>
+    <w:p>
+      <w:pPr>
+        <w:numPr>
+          <w:ilvl w:val="0"/>
+          <w:numId w:val="50"/>
+        </w:numPr>
+        <w:spacing w:before="0" w:after="80" w:line="300" w:lineRule="auto"/>
+      </w:pPr>
+      <w:r>
+        <w:rPr>
+          <w:rFonts w:ascii="Calibri" w:hAnsi="Calibri" w:eastAsia="Calibri"/>
+        </w:rPr>
+        <w:t>автоматическое обновление приложения;</w:t>
+      </w:r>
+    </w:p>
+    <w:p>
+      <w:pPr>
+        <w:numPr>
+          <w:ilvl w:val="0"/>
+          <w:numId w:val="50"/>
+        </w:numPr>
+        <w:spacing w:before="0" w:after="80" w:line="300" w:lineRule="auto"/>
+      </w:pPr>
+      <w:r>
+        <w:rPr>
+          <w:rFonts w:ascii="Calibri" w:hAnsi="Calibri" w:eastAsia="Calibri"/>
+        </w:rPr>
+        <w:t>встроенная анонимизация/редакция чувствительных данных;</w:t>
+      </w:r>
+    </w:p>
+    <w:p>
+      <w:pPr>
+        <w:numPr>
+          <w:ilvl w:val="0"/>
+          <w:numId w:val="50"/>
+        </w:numPr>
+        <w:spacing w:before="0" w:after="80" w:line="300" w:lineRule="auto"/>
+      </w:pPr>
+      <w:r>
+        <w:rPr>
+          <w:rFonts w:ascii="Calibri" w:hAnsi="Calibri" w:eastAsia="Calibri"/>
+        </w:rPr>
+        <w:t>шифрование локальной библиотеки на уровне самого приложения;</w:t>
+      </w:r>
+    </w:p>
+    <w:p>
+      <w:pPr>
+        <w:numPr>
+          <w:ilvl w:val="0"/>
+          <w:numId w:val="50"/>
+        </w:numPr>
+        <w:spacing w:before="0" w:after="80" w:line="300" w:lineRule="auto"/>
+      </w:pPr>
+      <w:r>
+        <w:rPr>
+          <w:rFonts w:ascii="Calibri" w:hAnsi="Calibri" w:eastAsia="Calibri"/>
+        </w:rPr>
+        <w:t>поиск по семантике/эмбеддингам, чат с транскриптами или RAG;</w:t>
+      </w:r>
+    </w:p>
+    <w:p>
+      <w:pPr>
+        <w:numPr>
+          <w:ilvl w:val="0"/>
+          <w:numId w:val="50"/>
+        </w:numPr>
+        <w:spacing w:before="0" w:after="80" w:line="300" w:lineRule="auto"/>
+      </w:pPr>
+      <w:r>
+        <w:rPr>
+          <w:rFonts w:ascii="Calibri" w:hAnsi="Calibri" w:eastAsia="Calibri"/>
+        </w:rPr>
+        <w:t>пакетное переименование;</w:t>
+      </w:r>
+    </w:p>
+    <w:p>
+      <w:pPr>
+        <w:numPr>
+          <w:ilvl w:val="0"/>
+          <w:numId w:val="50"/>
+        </w:numPr>
+        <w:spacing w:before="0" w:after="80" w:line="300" w:lineRule="auto"/>
+      </w:pPr>
+      <w:r>
+        <w:rPr>
+          <w:rFonts w:ascii="Calibri" w:hAnsi="Calibri" w:eastAsia="Calibri"/>
+        </w:rPr>
+        <w:t>ручной переключатель языка интерфейса;</w:t>
+      </w:r>
+    </w:p>
+    <w:p>
+      <w:pPr>
+        <w:numPr>
+          <w:ilvl w:val="0"/>
+          <w:numId w:val="50"/>
+        </w:numPr>
+        <w:spacing w:before="0" w:after="80" w:line="300" w:lineRule="auto"/>
+      </w:pPr>
+      <w:r>
+        <w:rPr>
+          <w:rFonts w:ascii="Calibri" w:hAnsi="Calibri" w:eastAsia="Calibri"/>
+        </w:rPr>
+        <w:t>полноценная поддержка Intel Mac;</w:t>
+      </w:r>
+    </w:p>
+    <w:p>
+      <w:pPr>
+        <w:numPr>
+          <w:ilvl w:val="0"/>
+          <w:numId w:val="50"/>
+        </w:numPr>
+        <w:spacing w:before="0" w:after="80" w:line="300" w:lineRule="auto"/>
+      </w:pPr>
+      <w:r>
+        <w:rPr>
+          <w:rFonts w:ascii="Calibri" w:hAnsi="Calibri" w:eastAsia="Calibri"/>
+        </w:rPr>
+        <w:t>гарантированная Apple notarization публичных сборок.</w:t>
+      </w:r>
+    </w:p>
+    <w:p>
+      <w:pPr>
+        <w:pStyle w:val="Heading1"/>
+      </w:pPr>
+      <w:r>
+        <w:rPr>
+          <w:rFonts w:ascii="Calibri" w:hAnsi="Calibri" w:eastAsia="Calibri"/>
+          <w:color w:val="2E74B5"/>
+          <w:sz w:val="32"/>
+        </w:rPr>
+        <w:t>15. Сильные стороны, которые важно не потерять при заимствовании идей</w:t>
+      </w:r>
+    </w:p>
+    <w:p>
+      <w:r>
+        <w:rPr>
+          <w:rFonts w:ascii="Calibri" w:hAnsi="Calibri" w:eastAsia="Calibri"/>
+        </w:rPr>
+        <w:t>При оценке функций конкурентов следует считать базовыми принципами GZWhisper:</w:t>
+      </w:r>
+    </w:p>
+    <w:p>
+      <w:pPr>
+        <w:numPr>
+          <w:ilvl w:val="0"/>
+          <w:numId w:val="51"/>
+        </w:numPr>
+        <w:spacing w:before="0" w:after="80" w:line="300" w:lineRule="auto"/>
+      </w:pPr>
+      <w:r>
+        <w:rPr>
+          <w:rFonts w:ascii="Calibri" w:hAnsi="Calibri" w:eastAsia="Calibri"/>
+          <w:b/>
+        </w:rPr>
+        <w:t>Local-first:</w:t>
+      </w:r>
+      <w:r>
+        <w:rPr>
+          <w:rFonts w:ascii="Calibri" w:hAnsi="Calibri" w:eastAsia="Calibri"/>
+        </w:rPr>
+        <w:t xml:space="preserve"> основной контент пользователя остаётся на его компьютере.</w:t>
+      </w:r>
+    </w:p>
+    <w:p>
+      <w:pPr>
+        <w:numPr>
+          <w:ilvl w:val="0"/>
+          <w:numId w:val="51"/>
+        </w:numPr>
+        <w:spacing w:before="0" w:after="80" w:line="300" w:lineRule="auto"/>
+      </w:pPr>
+      <w:r>
+        <w:rPr>
+          <w:rFonts w:ascii="Calibri" w:hAnsi="Calibri" w:eastAsia="Calibri"/>
+          <w:b/>
+        </w:rPr>
+        <w:t>Отсутствие обязательного аккаунта:</w:t>
+      </w:r>
+      <w:r>
+        <w:rPr>
+          <w:rFonts w:ascii="Calibri" w:hAnsi="Calibri" w:eastAsia="Calibri"/>
+        </w:rPr>
+        <w:t xml:space="preserve"> быстрый старт и независимость от облачного сервиса.</w:t>
+      </w:r>
+    </w:p>
+    <w:p>
+      <w:pPr>
+        <w:numPr>
+          <w:ilvl w:val="0"/>
+          <w:numId w:val="51"/>
+        </w:numPr>
+        <w:spacing w:before="0" w:after="80" w:line="300" w:lineRule="auto"/>
+      </w:pPr>
+      <w:r>
+        <w:rPr>
+          <w:rFonts w:ascii="Calibri" w:hAnsi="Calibri" w:eastAsia="Calibri"/>
+          <w:b/>
+        </w:rPr>
+        <w:t>Предсказуемое владение файлами:</w:t>
+      </w:r>
+      <w:r>
+        <w:rPr>
+          <w:rFonts w:ascii="Calibri" w:hAnsi="Calibri" w:eastAsia="Calibri"/>
+        </w:rPr>
+        <w:t xml:space="preserve"> обычные TXT, JSON и M4A доступны вне приложения.</w:t>
+      </w:r>
+    </w:p>
+    <w:p>
+      <w:pPr>
+        <w:numPr>
+          <w:ilvl w:val="0"/>
+          <w:numId w:val="51"/>
+        </w:numPr>
+        <w:spacing w:before="0" w:after="80" w:line="300" w:lineRule="auto"/>
+      </w:pPr>
+      <w:r>
+        <w:rPr>
+          <w:rFonts w:ascii="Calibri" w:hAnsi="Calibri" w:eastAsia="Calibri"/>
+          <w:b/>
+        </w:rPr>
+        <w:t>Надёжность длительной записи:</w:t>
+      </w:r>
+      <w:r>
+        <w:rPr>
+          <w:rFonts w:ascii="Calibri" w:hAnsi="Calibri" w:eastAsia="Calibri"/>
+        </w:rPr>
+        <w:t xml:space="preserve"> staging, фрагментированные файлы, sleep/wake handling и single-track fallback.</w:t>
+      </w:r>
+    </w:p>
+    <w:p>
+      <w:pPr>
+        <w:numPr>
+          <w:ilvl w:val="0"/>
+          <w:numId w:val="51"/>
+        </w:numPr>
+        <w:spacing w:before="0" w:after="80" w:line="300" w:lineRule="auto"/>
+      </w:pPr>
+      <w:r>
+        <w:rPr>
+          <w:rFonts w:ascii="Calibri" w:hAnsi="Calibri" w:eastAsia="Calibri"/>
+          <w:b/>
+        </w:rPr>
+        <w:t>Управляемая очередь:</w:t>
+      </w:r>
+      <w:r>
+        <w:rPr>
+          <w:rFonts w:ascii="Calibri" w:hAnsi="Calibri" w:eastAsia="Calibri"/>
+        </w:rPr>
+        <w:t xml:space="preserve"> пользователь контролирует порядок и может паузить, пропускать и отменять задания.</w:t>
+      </w:r>
+    </w:p>
+    <w:p>
+      <w:pPr>
+        <w:numPr>
+          <w:ilvl w:val="0"/>
+          <w:numId w:val="51"/>
+        </w:numPr>
+        <w:spacing w:before="0" w:after="80" w:line="300" w:lineRule="auto"/>
+      </w:pPr>
+      <w:r>
+        <w:rPr>
+          <w:rFonts w:ascii="Calibri" w:hAnsi="Calibri" w:eastAsia="Calibri"/>
+          <w:b/>
+        </w:rPr>
+        <w:t>Прозрачная модель:</w:t>
+      </w:r>
+      <w:r>
+        <w:rPr>
+          <w:rFonts w:ascii="Calibri" w:hAnsi="Calibri" w:eastAsia="Calibri"/>
+        </w:rPr>
+        <w:t xml:space="preserve"> видны её источник и папка; можно подключить свою локальную модель.</w:t>
+      </w:r>
+    </w:p>
+    <w:p>
+      <w:pPr>
+        <w:numPr>
+          <w:ilvl w:val="0"/>
+          <w:numId w:val="51"/>
+        </w:numPr>
+        <w:spacing w:before="0" w:after="80" w:line="300" w:lineRule="auto"/>
+      </w:pPr>
+      <w:r>
+        <w:rPr>
+          <w:rFonts w:ascii="Calibri" w:hAnsi="Calibri" w:eastAsia="Calibri"/>
+          <w:b/>
+        </w:rPr>
+        <w:t>Работа без тарификации по минутам:</w:t>
+      </w:r>
+      <w:r>
+        <w:rPr>
+          <w:rFonts w:ascii="Calibri" w:hAnsi="Calibri" w:eastAsia="Calibri"/>
+        </w:rPr>
+        <w:t xml:space="preserve"> после скачивания модели нет серверного счётчика обработки.</w:t>
+      </w:r>
+    </w:p>
+    <w:p>
+      <w:pPr>
+        <w:numPr>
+          <w:ilvl w:val="0"/>
+          <w:numId w:val="51"/>
+        </w:numPr>
+        <w:spacing w:before="0" w:after="80" w:line="300" w:lineRule="auto"/>
+      </w:pPr>
+      <w:r>
+        <w:rPr>
+          <w:rFonts w:ascii="Calibri" w:hAnsi="Calibri" w:eastAsia="Calibri"/>
+          <w:b/>
+        </w:rPr>
+        <w:t>macOS-native UX:</w:t>
+      </w:r>
+      <w:r>
+        <w:rPr>
+          <w:rFonts w:ascii="Calibri" w:hAnsi="Calibri" w:eastAsia="Calibri"/>
+        </w:rPr>
+        <w:t xml:space="preserve"> Finder, Trash/Undo, системные разрешения, light/dark mode, Spaces и компактный HUD.</w:t>
+      </w:r>
+    </w:p>
+    <w:p>
+      <w:pPr>
+        <w:numPr>
+          <w:ilvl w:val="0"/>
+          <w:numId w:val="51"/>
+        </w:numPr>
+        <w:spacing w:before="0" w:after="80" w:line="300" w:lineRule="auto"/>
+      </w:pPr>
+      <w:r>
+        <w:rPr>
+          <w:rFonts w:ascii="Calibri" w:hAnsi="Calibri" w:eastAsia="Calibri"/>
           <w:b/>
         </w:rPr>
         <w:t>Сохранность импортированных оригиналов:</w:t>
@@ -6885,22 +6997,7 @@
         <w:rPr>
           <w:rFonts w:ascii="Calibri" w:hAnsi="Calibri" w:eastAsia="Calibri"/>
         </w:rPr>
-        <w:t xml:space="preserve">, скриптами сборки и commit </w:t>
-      </w:r>
-      <w:r>
-        <w:rPr>
-          <w:rFonts w:ascii="Menlo" w:hAnsi="Menlo" w:eastAsia="Menlo"/>
-          <w:color w:val="1F4D78"/>
-          <w:sz w:val="21"/>
-          <w:shd w:fill="EDF1F5"/>
-        </w:rPr>
-        <w:t>05cdd4d</w:t>
-      </w:r>
-      <w:r>
-        <w:rPr>
-          <w:rFonts w:ascii="Calibri" w:hAnsi="Calibri" w:eastAsia="Calibri"/>
-        </w:rPr>
-        <w:t>.</w:t>
+        <w:t xml:space="preserve"> и скриптами сборки.</w:t>
       </w:r>
     </w:p>
     <w:sectPr>
@@ -6931,7 +7028,7 @@
         <w:color w:val="5D6875"/>
         <w:sz w:val="18"/>
       </w:rPr>
-      <w:t>v1.5.2 + commit 05cdd4d · 03.09.2026</w:t>
+      <w:t>v1.5.2 · состояние 04.09.2026</w:t>
     </w:r>
     <w:r>
       <w:tab/>
@@ -8096,6 +8193,28 @@
   </w:abstractNum>
   <w:num w:numId="50">
     <w:abstractNumId w:val="49"/>
+  </w:num>
+  <w:abstractNum w:abstractNumId="50">
+    <w:multiLevelType w:val="singleLevel"/>
+    <w:lvl w:ilvl="0">
+      <w:start w:val="1"/>
+      <w:numFmt w:val="bullet"/>
+      <w:lvlText w:val="•"/>
+      <w:lvlJc w:val="left"/>
+      <w:pPr>
+        <w:tabs>
+          <w:tab w:val="num" w:pos="260"/>
+        </w:tabs>
+        <w:ind w:left="540" w:hanging="270"/>
+        <w:spacing w:before="0" w:after="80" w:line="300" w:lineRule="auto"/>
+      </w:pPr>
+      <w:rPr>
+        <w:rFonts w:ascii="Calibri" w:hAnsi="Calibri"/>
+      </w:rPr>
+    </w:lvl>
+  </w:abstractNum>
+  <w:num w:numId="51">
+    <w:abstractNumId w:val="50"/>
   </w:num>
 </w:numbering>
 </file>

</xml_diff>